<commit_message>
Changed objective to summary
</commit_message>
<xml_diff>
--- a/Backend/FAANG_template - Copy.docx
+++ b/Backend/FAANG_template - Copy.docx
@@ -161,7 +161,6 @@
           <w:rFonts w:asciiTheme="minorHAnsi" w:hAnsiTheme="minorHAnsi" w:cstheme="minorHAnsi"/>
           <w:b/>
           <w:bCs/>
-          <w:spacing w:val="-2"/>
           <w:w w:val="150"/>
         </w:rPr>
       </w:pPr>
@@ -258,10 +257,9 @@
           <w:rFonts w:asciiTheme="minorHAnsi" w:hAnsiTheme="minorHAnsi" w:cstheme="minorHAnsi"/>
           <w:b/>
           <w:bCs/>
-          <w:spacing w:val="-2"/>
           <w:w w:val="150"/>
         </w:rPr>
-        <w:t>Summary</w:t>
+        <w:t>Objective</w:t>
       </w:r>
     </w:p>
     <w:p>
@@ -277,7 +275,19 @@
         <w:rPr>
           <w:rFonts w:asciiTheme="minorHAnsi" w:hAnsiTheme="minorHAnsi" w:cstheme="minorHAnsi"/>
         </w:rPr>
-        <w:t>{{resume_summary}}</w:t>
+        <w:t>{{resume_</w:t>
+      </w:r>
+      <w:r>
+        <w:rPr>
+          <w:rFonts w:asciiTheme="minorHAnsi" w:hAnsiTheme="minorHAnsi" w:cstheme="minorHAnsi"/>
+        </w:rPr>
+        <w:t>objective</w:t>
+      </w:r>
+      <w:r>
+        <w:rPr>
+          <w:rFonts w:asciiTheme="minorHAnsi" w:hAnsiTheme="minorHAnsi" w:cstheme="minorHAnsi"/>
+        </w:rPr>
+        <w:t>}}</w:t>
       </w:r>
     </w:p>
     <w:p>
@@ -1594,7 +1604,6 @@
         </w:tabs>
         <w:spacing w:before="89"/>
         <w:ind w:left="216" w:right="216"/>
-        <w:jc w:val="both"/>
         <w:rPr>
           <w:rFonts w:asciiTheme="minorHAnsi" w:hAnsiTheme="minorHAnsi" w:cstheme="minorHAnsi"/>
         </w:rPr>

</xml_diff>